<commit_message>
Update ZapDocs without Supabase secrets
</commit_message>
<xml_diff>
--- a/guaranty_template.docx
+++ b/guaranty_template.docx
@@ -18040,10 +18040,11 @@
     </w:p>
     <w:p>
       <w:pPr>
-        <w:pStyle w:val="Heading1"/>
-        <w:spacing w:before="252"/>
-        <w:rPr>
-          <w:spacing w:val="-2"/>
+        <w:pStyle w:val="BodyText"/>
+        <w:ind w:left="0" w:right="0"/>
+        <w:jc w:val="left"/>
+        <w:rPr>
+          <w:b/>
         </w:rPr>
       </w:pPr>
     </w:p>
@@ -18054,6 +18055,32 @@
         <w:jc w:val="left"/>
         <w:rPr>
           <w:b/>
+          <w:bCs/>
+        </w:rPr>
+      </w:pPr>
+      <w:r>
+        <w:rPr>
+          <w:b/>
+          <w:bCs/>
+        </w:rPr>
+        <w:t xml:space="preserve">       </w:t>
+      </w:r>
+      <w:r>
+        <w:rPr>
+          <w:b/>
+          <w:bCs/>
+        </w:rPr>
+        <w:t>{{SIGNATURE_FOOTER}}</w:t>
+      </w:r>
+    </w:p>
+    <w:p>
+      <w:pPr>
+        <w:pStyle w:val="BodyText"/>
+        <w:ind w:left="0" w:right="0"/>
+        <w:jc w:val="left"/>
+        <w:rPr>
+          <w:b/>
+          <w:bCs/>
         </w:rPr>
       </w:pPr>
     </w:p>
@@ -18064,6 +18091,18 @@
         <w:jc w:val="left"/>
         <w:rPr>
           <w:b/>
+          <w:bCs/>
+        </w:rPr>
+      </w:pPr>
+    </w:p>
+    <w:p>
+      <w:pPr>
+        <w:pStyle w:val="BodyText"/>
+        <w:ind w:left="0" w:right="0"/>
+        <w:jc w:val="left"/>
+        <w:rPr>
+          <w:b/>
+          <w:bCs/>
           <w:sz w:val="20"/>
         </w:rPr>
       </w:pPr>
@@ -18152,7 +18191,7 @@
           </mc:Choice>
           <mc:Fallback>
             <w:pict>
-              <v:shape w14:anchorId="05735D63" id="Graphic 7" o:spid="_x0000_s1026" style="position:absolute;margin-left:1in;margin-top:13.65pt;width:225.55pt;height:.1pt;z-index:-15728640;visibility:visible;mso-wrap-style:square;mso-wrap-distance-left:0;mso-wrap-distance-top:0;mso-wrap-distance-right:0;mso-wrap-distance-bottom:0;mso-position-horizontal:absolute;mso-position-horizontal-relative:page;mso-position-vertical:absolute;mso-position-vertical-relative:text;v-text-anchor:top" coordsize="2864485,1270" o:gfxdata="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" path="m,l2864179,e" filled="f" strokeweight=".15492mm">
+              <v:shape w14:anchorId="6A56FFB5" id="Graphic 7" o:spid="_x0000_s1026" style="position:absolute;margin-left:1in;margin-top:13.65pt;width:225.55pt;height:.1pt;z-index:-15728640;visibility:visible;mso-wrap-style:square;mso-wrap-distance-left:0;mso-wrap-distance-top:0;mso-wrap-distance-right:0;mso-wrap-distance-bottom:0;mso-position-horizontal:absolute;mso-position-horizontal-relative:page;mso-position-vertical:absolute;mso-position-vertical-relative:text;v-text-anchor:top" coordsize="2864485,1270" o:gfxdata="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" path="m,l2864179,e" filled="f" strokeweight=".15492mm">
                 <v:path arrowok="t"/>
                 <w10:wrap type="topAndBottom" anchorx="page"/>
               </v:shape>
@@ -18168,17 +18207,18 @@
         <w:jc w:val="left"/>
       </w:pPr>
       <w:r>
-        <w:t>{{SIGNATURE_FOOTER}}</w:t>
-      </w:r>
-    </w:p>
-    <w:p>
-      <w:pPr>
-        <w:pStyle w:val="BodyText"/>
-        <w:ind w:left="359" w:right="0"/>
-        <w:jc w:val="left"/>
-      </w:pPr>
-      <w:r>
-        <w:t>{{SIGNATURE_TITLE}}</w:t>
+        <w:t>{{SIGNATURE_</w:t>
+      </w:r>
+      <w:proofErr w:type="gramStart"/>
+      <w:r>
+        <w:t>FOOTER}}</w:t>
+      </w:r>
+      <w:r>
+        <w:t>,</w:t>
+      </w:r>
+      <w:proofErr w:type="gramEnd"/>
+      <w:r>
+        <w:t xml:space="preserve"> an individual </w:t>
       </w:r>
     </w:p>
     <w:p>
@@ -18551,7 +18591,7 @@
         </mc:Choice>
         <mc:Fallback>
           <w:pict>
-            <v:shape w14:anchorId="5BE3CA6F" id="Graphic 1" o:spid="_x0000_s1026" style="position:absolute;margin-left:1in;margin-top:723.8pt;width:468pt;height:.55pt;z-index:-251666432;visibility:visible;mso-wrap-style:square;mso-wrap-distance-left:0;mso-wrap-distance-top:0;mso-wrap-distance-right:0;mso-wrap-distance-bottom:0;mso-position-horizontal:absolute;mso-position-horizontal-relative:page;mso-position-vertical:absolute;mso-position-vertical-relative:page;v-text-anchor:top" coordsize="5943600,6985" o:gfxdata="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" path="m5943600,l,,,6858r5943600,l5943600,xe" fillcolor="black" stroked="f">
+            <v:shape w14:anchorId="482DB189" id="Graphic 1" o:spid="_x0000_s1026" style="position:absolute;margin-left:1in;margin-top:723.8pt;width:468pt;height:.55pt;z-index:-251666432;visibility:visible;mso-wrap-style:square;mso-wrap-distance-left:0;mso-wrap-distance-top:0;mso-wrap-distance-right:0;mso-wrap-distance-bottom:0;mso-position-horizontal:absolute;mso-position-horizontal-relative:page;mso-position-vertical:absolute;mso-position-vertical-relative:page;v-text-anchor:top" coordsize="5943600,6985" o:gfxdata="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" path="m5943600,l,,,6858r5943600,l5943600,xe" fillcolor="black" stroked="f">
               <v:path arrowok="t"/>
               <w10:wrap anchorx="page" anchory="page"/>
             </v:shape>

</xml_diff>